<commit_message>
Corecciones (retro fase 1)
</commit_message>
<xml_diff>
--- a/Evidencias CAPSTONE/Fase 1/Evidencias de proyecto/Acta_de_Constitucion_Alunza.docx
+++ b/Evidencias CAPSTONE/Fase 1/Evidencias de proyecto/Acta_de_Constitucion_Alunza.docx
@@ -214,7 +214,7 @@
                     <v:stroke joinstyle="miter"/>
                     <v:path gradientshapeok="t" o:connecttype="rect"/>
                   </v:shapetype>
-                  <v:shape id="Cuadro de texto 131" o:spid="_x0000_s1026" type="#_x0000_t202" alt="Título: Bloque de título del acta de constitución de Alunza - Descripción: Bloque de título del acta de constitución de Alunza" style="position:absolute;margin-left:38.8pt;margin-top:352.75pt;width:369pt;height:529.2pt;z-index:251660288;visibility:visible;mso-wrap-style:square;mso-width-percent:790;mso-height-percent:350;mso-wrap-distance-left:14.4pt;mso-wrap-distance-top:0;mso-wrap-distance-right:14.4pt;mso-wrap-distance-bottom:0;mso-position-horizontal:absolute;mso-position-horizontal-relative:margin;mso-position-vertical:absolute;mso-position-vertical-relative:page;mso-width-percent:790;mso-height-percent:350;mso-width-relative:margin;mso-height-relative:page;v-text-anchor:top" o:gfxdata="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" filled="f" stroked="f" strokeweight=".5pt">
+                  <v:shape id="Cuadro de texto 131" o:spid="_x0000_s1026" type="#_x0000_t202" alt="Título: Bloque de título del acta de constitución de Alunza - Descripción: Bloque de título del acta de constitución de Alunza" style="position:absolute;margin-left:38.8pt;margin-top:352.75pt;width:369pt;height:529.2pt;z-index:251660288;visibility:visible;mso-wrap-style:square;mso-width-percent:790;mso-height-percent:350;mso-wrap-distance-left:14.4pt;mso-wrap-distance-top:0;mso-wrap-distance-right:14.4pt;mso-wrap-distance-bottom:0;mso-position-horizontal:absolute;mso-position-horizontal-relative:margin;mso-position-vertical:absolute;mso-position-vertical-relative:page;mso-width-percent:790;mso-height-percent:350;mso-width-relative:margin;mso-height-relative:page;v-text-anchor:top" o:gfxdata="UEsDBBQABgAIAAAAIQC2gziS/gAAAOEBAAATAAAAW0NvbnRlbnRfVHlwZXNdLnhtbJSRQU7DMBBF 90jcwfIWJU67QAgl6YK0S0CoHGBkTxKLZGx5TGhvj5O2G0SRWNoz/78nu9wcxkFMGNg6quQqL6RA 0s5Y6ir5vt9lD1JwBDIwOMJKHpHlpr69KfdHjyxSmriSfYz+USnWPY7AufNIadK6MEJMx9ApD/oD OlTrorhX2lFEilmcO2RdNtjC5xDF9pCuTyYBB5bi6bQ4syoJ3g9WQ0ymaiLzg5KdCXlKLjvcW893 SUOqXwnz5DrgnHtJTxOsQfEKIT7DmDSUCaxw7Rqn8787ZsmRM9e2VmPeBN4uqYvTtW7jvijg9N/y JsXecLq0q+WD6m8AAAD//wMAUEsDBBQABgAIAAAAIQA4/SH/1gAAAJQBAAALAAAAX3JlbHMvLnJl bHOkkMFqwzAMhu+DvYPRfXGawxijTi+j0GvpHsDYimMaW0Yy2fr2M4PBMnrbUb/Q94l/f/hMi1qR JVI2sOt6UJgd+ZiDgffL8ekFlFSbvV0oo4EbChzGx4f9GRdb25HMsYhqlCwG5lrLq9biZkxWOiqY 22YiTra2kYMu1l1tQD30/bPm3wwYN0x18gb45AdQl1tp5j/sFB2T0FQ7R0nTNEV3j6o9feQzro1i OWA14Fm+Q8a1a8+Bvu/d/dMb2JY5uiPbhG/ktn4cqGU/er3pcvwCAAD//wMAUEsDBBQABgAIAAAA IQDqBzapXgIAAC4FAAAOAAAAZHJzL2Uyb0RvYy54bWysVN9v2jAQfp+0/8Hy+0igHUOooWKtOk1C bTU69dk4donm+Dz7IGF//c5OAhXbS6e9OBff7+++89V1Wxu2Vz5UYAs+HuWcKSuhrOxLwb8/3X2Y cRZQ2FIYsKrgBxX49eL9u6vGzdUEtmBK5RkFsWHeuIJvEd08y4LcqlqEEThlSanB1wLp179kpRcN Ra9NNsnzadaAL50HqUKg29tOyRcpvtZK4oPWQSEzBafaMJ0+nZt4ZosrMX/xwm0r2Zch/qGKWlSW kh5D3QoUbOerP0LVlfQQQONIQp2B1pVUqQfqZpyfdbPeCqdSLwROcEeYwv8LK+/3a/foGbafoaUB RkAaF+aBLmM/rfZ1/FKljPQE4eEIm2qRSbq8nM6mFzmpJOmmnyb57DIBm53cnQ/4RUHNolBwT3NJ cIn9KiClJNPBJGazcFcZk2ZjLGso6sXHPDkcNeRhbLRVacp9mFPpScKDUdHG2G9Ks6pMHcSLxC91 YzzbC2KGkFJZTM2nuGQdrTQV8RbH3v5U1Vucuz6GzGDx6FxXFnzq/qzs8sdQsu7sCchXfUcR203b j3QD5YEm7aFbguDkXUXTWImAj8IT62mCtMn4QIc2QKhDL3G2Bf/rb/fRnshIWs4a2qKCh5874RVn 5qslmsaVGwQ/CJtBsLv6Bgj+Mb0RTiaRHDyaQdQe6mda8GXMQiphJeUqOA7iDXa7TA+EVMtlMqLF cgJXdu1kDB2nEbn11D4L73oCInH3Hob9EvMzHna2iShuuUNiYyJpBLRDsQealjJxt39A4ta//k9W p2du8RsAAP//AwBQSwMEFAAGAAgAAAAhAAIHmuniAAAACwEAAA8AAABkcnMvZG93bnJldi54bWxM j8FOwzAMhu9IvENkJG4sHdB2lKYTDMEB7QBjEnDLGtNWNE5psrbj6TEnOFm2P/3+nC8n24oBe984 UjCfRSCQSmcaqhRsX+7PFiB80GR06wgVHNDDsjg+ynVm3EjPOGxCJTiEfKYV1CF0mZS+rNFqP3Md Eu8+XG914LavpOn1yOG2ledRlEirG+ILte5wVWP5udlbBV9P/jJa3Y6Pb/r7cPe6fRje1+tBqdOT 6eYaRMAp/MHwq8/qULDTzu3JeNEqSNOESa5RHINgYDGPebJjMk0urkAWufz/Q/EDAAD//wMAUEsB Ai0AFAAGAAgAAAAhALaDOJL+AAAA4QEAABMAAAAAAAAAAAAAAAAAAAAAAFtDb250ZW50X1R5cGVz XS54bWxQSwECLQAUAAYACAAAACEAOP0h/9YAAACUAQAACwAAAAAAAAAAAAAAAAAvAQAAX3JlbHMv LnJlbHNQSwECLQAUAAYACAAAACEA6gc2qV4CAAAuBQAADgAAAAAAAAAAAAAAAAAuAgAAZHJzL2Uy b0RvYy54bWxQSwECLQAUAAYACAAAACEAAgea6eIAAAALAQAADwAAAAAAAAAAAAAAAAC4BAAAZHJz L2Rvd25yZXYueG1sUEsFBgAAAAAEAAQA8wAAAMcFAAAAAA== " filled="f" stroked="f" strokeweight=".5pt">
                     <v:textbox style="mso-fit-shape-to-text:t" inset="0,0,0,0">
                       <w:txbxContent>
                         <w:p>
@@ -335,12 +335,6 @@
                 </w:pict>
               </mc:Fallback>
             </mc:AlternateContent>
-          </w:r>
-          <w:r>
-            <w:rPr>
-              <w:noProof/>
-              <w:lang w:val="es-ES" w:eastAsia="es-ES"/>
-            </w:rPr>
             <w:drawing>
               <wp:inline distT="0" distB="0" distL="0" distR="0" wp14:anchorId="133FB71F" wp14:editId="0E60E7D2">
                 <wp:extent cx="6400800" cy="1063625"/>
@@ -427,8 +421,6 @@
       </w:pPr>
       <w:r>
         <w:t>Índice de contenidos</w:t>
-      </w:r>
-      <w:r>
         <w:tab/>
         <w:t>2</w:t>
       </w:r>
@@ -465,46 +457,10 @@
             <w:webHidden/>
           </w:rPr>
           <w:tab/>
-        </w:r>
-        <w:r>
-          <w:rPr>
-            <w:noProof/>
-            <w:webHidden/>
-          </w:rPr>
           <w:fldChar w:fldCharType="begin"/>
-        </w:r>
-        <w:r>
-          <w:rPr>
-            <w:noProof/>
-            <w:webHidden/>
-          </w:rPr>
           <w:instrText xml:space="preserve"> PAGEREF _Toc97383729 \h </w:instrText>
-        </w:r>
-        <w:r>
-          <w:rPr>
-            <w:noProof/>
-            <w:webHidden/>
-          </w:rPr>
-        </w:r>
-        <w:r>
-          <w:rPr>
-            <w:noProof/>
-            <w:webHidden/>
-          </w:rPr>
           <w:fldChar w:fldCharType="separate"/>
-        </w:r>
-        <w:r>
-          <w:rPr>
-            <w:noProof/>
-            <w:webHidden/>
-          </w:rPr>
           <w:t>2</w:t>
-        </w:r>
-        <w:r>
-          <w:rPr>
-            <w:noProof/>
-            <w:webHidden/>
-          </w:rPr>
           <w:fldChar w:fldCharType="end"/>
         </w:r>
       </w:hyperlink>
@@ -539,46 +495,10 @@
             <w:webHidden/>
           </w:rPr>
           <w:tab/>
-        </w:r>
-        <w:r>
-          <w:rPr>
-            <w:noProof/>
-            <w:webHidden/>
-          </w:rPr>
           <w:fldChar w:fldCharType="begin"/>
-        </w:r>
-        <w:r>
-          <w:rPr>
-            <w:noProof/>
-            <w:webHidden/>
-          </w:rPr>
           <w:instrText xml:space="preserve"> PAGEREF _Toc97383730 \h </w:instrText>
-        </w:r>
-        <w:r>
-          <w:rPr>
-            <w:noProof/>
-            <w:webHidden/>
-          </w:rPr>
-        </w:r>
-        <w:r>
-          <w:rPr>
-            <w:noProof/>
-            <w:webHidden/>
-          </w:rPr>
           <w:fldChar w:fldCharType="separate"/>
-        </w:r>
-        <w:r>
-          <w:rPr>
-            <w:noProof/>
-            <w:webHidden/>
-          </w:rPr>
           <w:t>2</w:t>
-        </w:r>
-        <w:r>
-          <w:rPr>
-            <w:noProof/>
-            <w:webHidden/>
-          </w:rPr>
           <w:fldChar w:fldCharType="end"/>
         </w:r>
       </w:hyperlink>
@@ -613,46 +533,10 @@
             <w:webHidden/>
           </w:rPr>
           <w:tab/>
-        </w:r>
-        <w:r>
-          <w:rPr>
-            <w:noProof/>
-            <w:webHidden/>
-          </w:rPr>
           <w:fldChar w:fldCharType="begin"/>
-        </w:r>
-        <w:r>
-          <w:rPr>
-            <w:noProof/>
-            <w:webHidden/>
-          </w:rPr>
           <w:instrText xml:space="preserve"> PAGEREF _Toc97383731 \h </w:instrText>
-        </w:r>
-        <w:r>
-          <w:rPr>
-            <w:noProof/>
-            <w:webHidden/>
-          </w:rPr>
-        </w:r>
-        <w:r>
-          <w:rPr>
-            <w:noProof/>
-            <w:webHidden/>
-          </w:rPr>
           <w:fldChar w:fldCharType="separate"/>
-        </w:r>
-        <w:r>
-          <w:rPr>
-            <w:noProof/>
-            <w:webHidden/>
-          </w:rPr>
           <w:t>2</w:t>
-        </w:r>
-        <w:r>
-          <w:rPr>
-            <w:noProof/>
-            <w:webHidden/>
-          </w:rPr>
           <w:fldChar w:fldCharType="end"/>
         </w:r>
       </w:hyperlink>
@@ -687,46 +571,10 @@
             <w:webHidden/>
           </w:rPr>
           <w:tab/>
-        </w:r>
-        <w:r>
-          <w:rPr>
-            <w:noProof/>
-            <w:webHidden/>
-          </w:rPr>
           <w:fldChar w:fldCharType="begin"/>
-        </w:r>
-        <w:r>
-          <w:rPr>
-            <w:noProof/>
-            <w:webHidden/>
-          </w:rPr>
           <w:instrText xml:space="preserve"> PAGEREF _Toc97383732 \h </w:instrText>
-        </w:r>
-        <w:r>
-          <w:rPr>
-            <w:noProof/>
-            <w:webHidden/>
-          </w:rPr>
-        </w:r>
-        <w:r>
-          <w:rPr>
-            <w:noProof/>
-            <w:webHidden/>
-          </w:rPr>
           <w:fldChar w:fldCharType="separate"/>
-        </w:r>
-        <w:r>
-          <w:rPr>
-            <w:noProof/>
-            <w:webHidden/>
-          </w:rPr>
           <w:t>2</w:t>
-        </w:r>
-        <w:r>
-          <w:rPr>
-            <w:noProof/>
-            <w:webHidden/>
-          </w:rPr>
           <w:fldChar w:fldCharType="end"/>
         </w:r>
       </w:hyperlink>
@@ -761,46 +609,10 @@
             <w:webHidden/>
           </w:rPr>
           <w:tab/>
-        </w:r>
-        <w:r>
-          <w:rPr>
-            <w:noProof/>
-            <w:webHidden/>
-          </w:rPr>
           <w:fldChar w:fldCharType="begin"/>
-        </w:r>
-        <w:r>
-          <w:rPr>
-            <w:noProof/>
-            <w:webHidden/>
-          </w:rPr>
           <w:instrText xml:space="preserve"> PAGEREF _Toc97383733 \h </w:instrText>
-        </w:r>
-        <w:r>
-          <w:rPr>
-            <w:noProof/>
-            <w:webHidden/>
-          </w:rPr>
-        </w:r>
-        <w:r>
-          <w:rPr>
-            <w:noProof/>
-            <w:webHidden/>
-          </w:rPr>
           <w:fldChar w:fldCharType="separate"/>
-        </w:r>
-        <w:r>
-          <w:rPr>
-            <w:noProof/>
-            <w:webHidden/>
-          </w:rPr>
           <w:t>2</w:t>
-        </w:r>
-        <w:r>
-          <w:rPr>
-            <w:noProof/>
-            <w:webHidden/>
-          </w:rPr>
           <w:fldChar w:fldCharType="end"/>
         </w:r>
       </w:hyperlink>
@@ -835,46 +647,10 @@
             <w:webHidden/>
           </w:rPr>
           <w:tab/>
-        </w:r>
-        <w:r>
-          <w:rPr>
-            <w:noProof/>
-            <w:webHidden/>
-          </w:rPr>
           <w:fldChar w:fldCharType="begin"/>
-        </w:r>
-        <w:r>
-          <w:rPr>
-            <w:noProof/>
-            <w:webHidden/>
-          </w:rPr>
           <w:instrText xml:space="preserve"> PAGEREF _Toc97383734 \h </w:instrText>
-        </w:r>
-        <w:r>
-          <w:rPr>
-            <w:noProof/>
-            <w:webHidden/>
-          </w:rPr>
-        </w:r>
-        <w:r>
-          <w:rPr>
-            <w:noProof/>
-            <w:webHidden/>
-          </w:rPr>
           <w:fldChar w:fldCharType="separate"/>
-        </w:r>
-        <w:r>
-          <w:rPr>
-            <w:noProof/>
-            <w:webHidden/>
-          </w:rPr>
           <w:t>3</w:t>
-        </w:r>
-        <w:r>
-          <w:rPr>
-            <w:noProof/>
-            <w:webHidden/>
-          </w:rPr>
           <w:fldChar w:fldCharType="end"/>
         </w:r>
       </w:hyperlink>
@@ -909,46 +685,10 @@
             <w:webHidden/>
           </w:rPr>
           <w:tab/>
-        </w:r>
-        <w:r>
-          <w:rPr>
-            <w:noProof/>
-            <w:webHidden/>
-          </w:rPr>
           <w:fldChar w:fldCharType="begin"/>
-        </w:r>
-        <w:r>
-          <w:rPr>
-            <w:noProof/>
-            <w:webHidden/>
-          </w:rPr>
           <w:instrText xml:space="preserve"> PAGEREF _Toc97383735 \h </w:instrText>
-        </w:r>
-        <w:r>
-          <w:rPr>
-            <w:noProof/>
-            <w:webHidden/>
-          </w:rPr>
-        </w:r>
-        <w:r>
-          <w:rPr>
-            <w:noProof/>
-            <w:webHidden/>
-          </w:rPr>
           <w:fldChar w:fldCharType="separate"/>
-        </w:r>
-        <w:r>
-          <w:rPr>
-            <w:noProof/>
-            <w:webHidden/>
-          </w:rPr>
           <w:t>3</w:t>
-        </w:r>
-        <w:r>
-          <w:rPr>
-            <w:noProof/>
-            <w:webHidden/>
-          </w:rPr>
           <w:fldChar w:fldCharType="end"/>
         </w:r>
       </w:hyperlink>
@@ -985,46 +725,10 @@
             <w:webHidden/>
           </w:rPr>
           <w:tab/>
-        </w:r>
-        <w:r>
-          <w:rPr>
-            <w:noProof/>
-            <w:webHidden/>
-          </w:rPr>
           <w:fldChar w:fldCharType="begin"/>
-        </w:r>
-        <w:r>
-          <w:rPr>
-            <w:noProof/>
-            <w:webHidden/>
-          </w:rPr>
           <w:instrText xml:space="preserve"> PAGEREF _Toc97383736 \h </w:instrText>
-        </w:r>
-        <w:r>
-          <w:rPr>
-            <w:noProof/>
-            <w:webHidden/>
-          </w:rPr>
-        </w:r>
-        <w:r>
-          <w:rPr>
-            <w:noProof/>
-            <w:webHidden/>
-          </w:rPr>
           <w:fldChar w:fldCharType="separate"/>
-        </w:r>
-        <w:r>
-          <w:rPr>
-            <w:noProof/>
-            <w:webHidden/>
-          </w:rPr>
           <w:t>3</w:t>
-        </w:r>
-        <w:r>
-          <w:rPr>
-            <w:noProof/>
-            <w:webHidden/>
-          </w:rPr>
           <w:fldChar w:fldCharType="end"/>
         </w:r>
       </w:hyperlink>
@@ -1059,46 +763,10 @@
             <w:webHidden/>
           </w:rPr>
           <w:tab/>
-        </w:r>
-        <w:r>
-          <w:rPr>
-            <w:noProof/>
-            <w:webHidden/>
-          </w:rPr>
           <w:fldChar w:fldCharType="begin"/>
-        </w:r>
-        <w:r>
-          <w:rPr>
-            <w:noProof/>
-            <w:webHidden/>
-          </w:rPr>
           <w:instrText xml:space="preserve"> PAGEREF _Toc97383737 \h </w:instrText>
-        </w:r>
-        <w:r>
-          <w:rPr>
-            <w:noProof/>
-            <w:webHidden/>
-          </w:rPr>
-        </w:r>
-        <w:r>
-          <w:rPr>
-            <w:noProof/>
-            <w:webHidden/>
-          </w:rPr>
           <w:fldChar w:fldCharType="separate"/>
-        </w:r>
-        <w:r>
-          <w:rPr>
-            <w:noProof/>
-            <w:webHidden/>
-          </w:rPr>
           <w:t>3</w:t>
-        </w:r>
-        <w:r>
-          <w:rPr>
-            <w:noProof/>
-            <w:webHidden/>
-          </w:rPr>
           <w:fldChar w:fldCharType="end"/>
         </w:r>
       </w:hyperlink>
@@ -1133,46 +801,10 @@
             <w:webHidden/>
           </w:rPr>
           <w:tab/>
-        </w:r>
-        <w:r>
-          <w:rPr>
-            <w:noProof/>
-            <w:webHidden/>
-          </w:rPr>
           <w:fldChar w:fldCharType="begin"/>
-        </w:r>
-        <w:r>
-          <w:rPr>
-            <w:noProof/>
-            <w:webHidden/>
-          </w:rPr>
           <w:instrText xml:space="preserve"> PAGEREF _Toc97383738 \h </w:instrText>
-        </w:r>
-        <w:r>
-          <w:rPr>
-            <w:noProof/>
-            <w:webHidden/>
-          </w:rPr>
-        </w:r>
-        <w:r>
-          <w:rPr>
-            <w:noProof/>
-            <w:webHidden/>
-          </w:rPr>
           <w:fldChar w:fldCharType="separate"/>
-        </w:r>
-        <w:r>
-          <w:rPr>
-            <w:noProof/>
-            <w:webHidden/>
-          </w:rPr>
           <w:t>3</w:t>
-        </w:r>
-        <w:r>
-          <w:rPr>
-            <w:noProof/>
-            <w:webHidden/>
-          </w:rPr>
           <w:fldChar w:fldCharType="end"/>
         </w:r>
       </w:hyperlink>
@@ -1207,46 +839,10 @@
             <w:webHidden/>
           </w:rPr>
           <w:tab/>
-        </w:r>
-        <w:r>
-          <w:rPr>
-            <w:noProof/>
-            <w:webHidden/>
-          </w:rPr>
           <w:fldChar w:fldCharType="begin"/>
-        </w:r>
-        <w:r>
-          <w:rPr>
-            <w:noProof/>
-            <w:webHidden/>
-          </w:rPr>
           <w:instrText xml:space="preserve"> PAGEREF _Toc97383739 \h </w:instrText>
-        </w:r>
-        <w:r>
-          <w:rPr>
-            <w:noProof/>
-            <w:webHidden/>
-          </w:rPr>
-        </w:r>
-        <w:r>
-          <w:rPr>
-            <w:noProof/>
-            <w:webHidden/>
-          </w:rPr>
           <w:fldChar w:fldCharType="separate"/>
-        </w:r>
-        <w:r>
-          <w:rPr>
-            <w:noProof/>
-            <w:webHidden/>
-          </w:rPr>
           <w:t>4</w:t>
-        </w:r>
-        <w:r>
-          <w:rPr>
-            <w:noProof/>
-            <w:webHidden/>
-          </w:rPr>
           <w:fldChar w:fldCharType="end"/>
         </w:r>
       </w:hyperlink>
@@ -1283,46 +879,10 @@
             <w:webHidden/>
           </w:rPr>
           <w:tab/>
-        </w:r>
-        <w:r>
-          <w:rPr>
-            <w:noProof/>
-            <w:webHidden/>
-          </w:rPr>
           <w:fldChar w:fldCharType="begin"/>
-        </w:r>
-        <w:r>
-          <w:rPr>
-            <w:noProof/>
-            <w:webHidden/>
-          </w:rPr>
           <w:instrText xml:space="preserve"> PAGEREF _Toc97383740 \h </w:instrText>
-        </w:r>
-        <w:r>
-          <w:rPr>
-            <w:noProof/>
-            <w:webHidden/>
-          </w:rPr>
-        </w:r>
-        <w:r>
-          <w:rPr>
-            <w:noProof/>
-            <w:webHidden/>
-          </w:rPr>
           <w:fldChar w:fldCharType="separate"/>
-        </w:r>
-        <w:r>
-          <w:rPr>
-            <w:noProof/>
-            <w:webHidden/>
-          </w:rPr>
           <w:t>4</w:t>
-        </w:r>
-        <w:r>
-          <w:rPr>
-            <w:noProof/>
-            <w:webHidden/>
-          </w:rPr>
           <w:fldChar w:fldCharType="end"/>
         </w:r>
       </w:hyperlink>
@@ -1357,46 +917,10 @@
             <w:webHidden/>
           </w:rPr>
           <w:tab/>
-        </w:r>
-        <w:r>
-          <w:rPr>
-            <w:noProof/>
-            <w:webHidden/>
-          </w:rPr>
           <w:fldChar w:fldCharType="begin"/>
-        </w:r>
-        <w:r>
-          <w:rPr>
-            <w:noProof/>
-            <w:webHidden/>
-          </w:rPr>
           <w:instrText xml:space="preserve"> PAGEREF _Toc97383741 \h </w:instrText>
-        </w:r>
-        <w:r>
-          <w:rPr>
-            <w:noProof/>
-            <w:webHidden/>
-          </w:rPr>
-        </w:r>
-        <w:r>
-          <w:rPr>
-            <w:noProof/>
-            <w:webHidden/>
-          </w:rPr>
           <w:fldChar w:fldCharType="separate"/>
-        </w:r>
-        <w:r>
-          <w:rPr>
-            <w:noProof/>
-            <w:webHidden/>
-          </w:rPr>
           <w:t>4</w:t>
-        </w:r>
-        <w:r>
-          <w:rPr>
-            <w:noProof/>
-            <w:webHidden/>
-          </w:rPr>
           <w:fldChar w:fldCharType="end"/>
         </w:r>
       </w:hyperlink>
@@ -1431,46 +955,10 @@
             <w:webHidden/>
           </w:rPr>
           <w:tab/>
-        </w:r>
-        <w:r>
-          <w:rPr>
-            <w:noProof/>
-            <w:webHidden/>
-          </w:rPr>
           <w:fldChar w:fldCharType="begin"/>
-        </w:r>
-        <w:r>
-          <w:rPr>
-            <w:noProof/>
-            <w:webHidden/>
-          </w:rPr>
           <w:instrText xml:space="preserve"> PAGEREF _Toc97383742 \h </w:instrText>
-        </w:r>
-        <w:r>
-          <w:rPr>
-            <w:noProof/>
-            <w:webHidden/>
-          </w:rPr>
-        </w:r>
-        <w:r>
-          <w:rPr>
-            <w:noProof/>
-            <w:webHidden/>
-          </w:rPr>
           <w:fldChar w:fldCharType="separate"/>
-        </w:r>
-        <w:r>
-          <w:rPr>
-            <w:noProof/>
-            <w:webHidden/>
-          </w:rPr>
           <w:t>4</w:t>
-        </w:r>
-        <w:r>
-          <w:rPr>
-            <w:noProof/>
-            <w:webHidden/>
-          </w:rPr>
           <w:fldChar w:fldCharType="end"/>
         </w:r>
       </w:hyperlink>
@@ -1505,46 +993,10 @@
             <w:webHidden/>
           </w:rPr>
           <w:tab/>
-        </w:r>
-        <w:r>
-          <w:rPr>
-            <w:noProof/>
-            <w:webHidden/>
-          </w:rPr>
           <w:fldChar w:fldCharType="begin"/>
-        </w:r>
-        <w:r>
-          <w:rPr>
-            <w:noProof/>
-            <w:webHidden/>
-          </w:rPr>
           <w:instrText xml:space="preserve"> PAGEREF _Toc97383743 \h </w:instrText>
-        </w:r>
-        <w:r>
-          <w:rPr>
-            <w:noProof/>
-            <w:webHidden/>
-          </w:rPr>
-        </w:r>
-        <w:r>
-          <w:rPr>
-            <w:noProof/>
-            <w:webHidden/>
-          </w:rPr>
           <w:fldChar w:fldCharType="separate"/>
-        </w:r>
-        <w:r>
-          <w:rPr>
-            <w:noProof/>
-            <w:webHidden/>
-          </w:rPr>
           <w:t>5</w:t>
-        </w:r>
-        <w:r>
-          <w:rPr>
-            <w:noProof/>
-            <w:webHidden/>
-          </w:rPr>
           <w:fldChar w:fldCharType="end"/>
         </w:r>
       </w:hyperlink>
@@ -1579,46 +1031,10 @@
             <w:webHidden/>
           </w:rPr>
           <w:tab/>
-        </w:r>
-        <w:r>
-          <w:rPr>
-            <w:noProof/>
-            <w:webHidden/>
-          </w:rPr>
           <w:fldChar w:fldCharType="begin"/>
-        </w:r>
-        <w:r>
-          <w:rPr>
-            <w:noProof/>
-            <w:webHidden/>
-          </w:rPr>
           <w:instrText xml:space="preserve"> PAGEREF _Toc97383744 \h </w:instrText>
-        </w:r>
-        <w:r>
-          <w:rPr>
-            <w:noProof/>
-            <w:webHidden/>
-          </w:rPr>
-        </w:r>
-        <w:r>
-          <w:rPr>
-            <w:noProof/>
-            <w:webHidden/>
-          </w:rPr>
           <w:fldChar w:fldCharType="separate"/>
-        </w:r>
-        <w:r>
-          <w:rPr>
-            <w:noProof/>
-            <w:webHidden/>
-          </w:rPr>
           <w:t>5</w:t>
-        </w:r>
-        <w:r>
-          <w:rPr>
-            <w:noProof/>
-            <w:webHidden/>
-          </w:rPr>
           <w:fldChar w:fldCharType="end"/>
         </w:r>
       </w:hyperlink>
@@ -1655,46 +1071,10 @@
             <w:webHidden/>
           </w:rPr>
           <w:tab/>
-        </w:r>
-        <w:r>
-          <w:rPr>
-            <w:noProof/>
-            <w:webHidden/>
-          </w:rPr>
           <w:fldChar w:fldCharType="begin"/>
-        </w:r>
-        <w:r>
-          <w:rPr>
-            <w:noProof/>
-            <w:webHidden/>
-          </w:rPr>
           <w:instrText xml:space="preserve"> PAGEREF _Toc97383745 \h </w:instrText>
-        </w:r>
-        <w:r>
-          <w:rPr>
-            <w:noProof/>
-            <w:webHidden/>
-          </w:rPr>
-        </w:r>
-        <w:r>
-          <w:rPr>
-            <w:noProof/>
-            <w:webHidden/>
-          </w:rPr>
           <w:fldChar w:fldCharType="separate"/>
-        </w:r>
-        <w:r>
-          <w:rPr>
-            <w:noProof/>
-            <w:webHidden/>
-          </w:rPr>
           <w:t>6</w:t>
-        </w:r>
-        <w:r>
-          <w:rPr>
-            <w:noProof/>
-            <w:webHidden/>
-          </w:rPr>
           <w:fldChar w:fldCharType="end"/>
         </w:r>
       </w:hyperlink>
@@ -1729,46 +1109,10 @@
             <w:webHidden/>
           </w:rPr>
           <w:tab/>
-        </w:r>
-        <w:r>
-          <w:rPr>
-            <w:noProof/>
-            <w:webHidden/>
-          </w:rPr>
           <w:fldChar w:fldCharType="begin"/>
-        </w:r>
-        <w:r>
-          <w:rPr>
-            <w:noProof/>
-            <w:webHidden/>
-          </w:rPr>
           <w:instrText xml:space="preserve"> PAGEREF _Toc97383746 \h </w:instrText>
-        </w:r>
-        <w:r>
-          <w:rPr>
-            <w:noProof/>
-            <w:webHidden/>
-          </w:rPr>
-        </w:r>
-        <w:r>
-          <w:rPr>
-            <w:noProof/>
-            <w:webHidden/>
-          </w:rPr>
           <w:fldChar w:fldCharType="separate"/>
-        </w:r>
-        <w:r>
-          <w:rPr>
-            <w:noProof/>
-            <w:webHidden/>
-          </w:rPr>
           <w:t>6</w:t>
-        </w:r>
-        <w:r>
-          <w:rPr>
-            <w:noProof/>
-            <w:webHidden/>
-          </w:rPr>
           <w:fldChar w:fldCharType="end"/>
         </w:r>
       </w:hyperlink>
@@ -1803,46 +1147,10 @@
             <w:webHidden/>
           </w:rPr>
           <w:tab/>
-        </w:r>
-        <w:r>
-          <w:rPr>
-            <w:noProof/>
-            <w:webHidden/>
-          </w:rPr>
           <w:fldChar w:fldCharType="begin"/>
-        </w:r>
-        <w:r>
-          <w:rPr>
-            <w:noProof/>
-            <w:webHidden/>
-          </w:rPr>
           <w:instrText xml:space="preserve"> PAGEREF _Toc97383747 \h </w:instrText>
-        </w:r>
-        <w:r>
-          <w:rPr>
-            <w:noProof/>
-            <w:webHidden/>
-          </w:rPr>
-        </w:r>
-        <w:r>
-          <w:rPr>
-            <w:noProof/>
-            <w:webHidden/>
-          </w:rPr>
           <w:fldChar w:fldCharType="separate"/>
-        </w:r>
-        <w:r>
-          <w:rPr>
-            <w:noProof/>
-            <w:webHidden/>
-          </w:rPr>
           <w:t>6</w:t>
-        </w:r>
-        <w:r>
-          <w:rPr>
-            <w:noProof/>
-            <w:webHidden/>
-          </w:rPr>
           <w:fldChar w:fldCharType="end"/>
         </w:r>
       </w:hyperlink>
@@ -1877,46 +1185,10 @@
             <w:webHidden/>
           </w:rPr>
           <w:tab/>
-        </w:r>
-        <w:r>
-          <w:rPr>
-            <w:noProof/>
-            <w:webHidden/>
-          </w:rPr>
           <w:fldChar w:fldCharType="begin"/>
-        </w:r>
-        <w:r>
-          <w:rPr>
-            <w:noProof/>
-            <w:webHidden/>
-          </w:rPr>
           <w:instrText xml:space="preserve"> PAGEREF _Toc97383748 \h </w:instrText>
-        </w:r>
-        <w:r>
-          <w:rPr>
-            <w:noProof/>
-            <w:webHidden/>
-          </w:rPr>
-        </w:r>
-        <w:r>
-          <w:rPr>
-            <w:noProof/>
-            <w:webHidden/>
-          </w:rPr>
           <w:fldChar w:fldCharType="separate"/>
-        </w:r>
-        <w:r>
-          <w:rPr>
-            <w:noProof/>
-            <w:webHidden/>
-          </w:rPr>
           <w:t>6</w:t>
-        </w:r>
-        <w:r>
-          <w:rPr>
-            <w:noProof/>
-            <w:webHidden/>
-          </w:rPr>
           <w:fldChar w:fldCharType="end"/>
         </w:r>
       </w:hyperlink>
@@ -1951,46 +1223,10 @@
             <w:webHidden/>
           </w:rPr>
           <w:tab/>
-        </w:r>
-        <w:r>
-          <w:rPr>
-            <w:noProof/>
-            <w:webHidden/>
-          </w:rPr>
           <w:fldChar w:fldCharType="begin"/>
-        </w:r>
-        <w:r>
-          <w:rPr>
-            <w:noProof/>
-            <w:webHidden/>
-          </w:rPr>
           <w:instrText xml:space="preserve"> PAGEREF _Toc97383749 \h </w:instrText>
-        </w:r>
-        <w:r>
-          <w:rPr>
-            <w:noProof/>
-            <w:webHidden/>
-          </w:rPr>
-        </w:r>
-        <w:r>
-          <w:rPr>
-            <w:noProof/>
-            <w:webHidden/>
-          </w:rPr>
           <w:fldChar w:fldCharType="separate"/>
-        </w:r>
-        <w:r>
-          <w:rPr>
-            <w:noProof/>
-            <w:webHidden/>
-          </w:rPr>
           <w:t>6</w:t>
-        </w:r>
-        <w:r>
-          <w:rPr>
-            <w:noProof/>
-            <w:webHidden/>
-          </w:rPr>
           <w:fldChar w:fldCharType="end"/>
         </w:r>
       </w:hyperlink>
@@ -2025,46 +1261,10 @@
             <w:webHidden/>
           </w:rPr>
           <w:tab/>
-        </w:r>
-        <w:r>
-          <w:rPr>
-            <w:noProof/>
-            <w:webHidden/>
-          </w:rPr>
           <w:fldChar w:fldCharType="begin"/>
-        </w:r>
-        <w:r>
-          <w:rPr>
-            <w:noProof/>
-            <w:webHidden/>
-          </w:rPr>
           <w:instrText xml:space="preserve"> PAGEREF _Toc97383750 \h </w:instrText>
-        </w:r>
-        <w:r>
-          <w:rPr>
-            <w:noProof/>
-            <w:webHidden/>
-          </w:rPr>
-        </w:r>
-        <w:r>
-          <w:rPr>
-            <w:noProof/>
-            <w:webHidden/>
-          </w:rPr>
           <w:fldChar w:fldCharType="separate"/>
-        </w:r>
-        <w:r>
-          <w:rPr>
-            <w:noProof/>
-            <w:webHidden/>
-          </w:rPr>
           <w:t>7</w:t>
-        </w:r>
-        <w:r>
-          <w:rPr>
-            <w:noProof/>
-            <w:webHidden/>
-          </w:rPr>
           <w:fldChar w:fldCharType="end"/>
         </w:r>
       </w:hyperlink>
@@ -2099,46 +1299,10 @@
             <w:webHidden/>
           </w:rPr>
           <w:tab/>
-        </w:r>
-        <w:r>
-          <w:rPr>
-            <w:noProof/>
-            <w:webHidden/>
-          </w:rPr>
           <w:fldChar w:fldCharType="begin"/>
-        </w:r>
-        <w:r>
-          <w:rPr>
-            <w:noProof/>
-            <w:webHidden/>
-          </w:rPr>
           <w:instrText xml:space="preserve"> PAGEREF _Toc97383751 \h </w:instrText>
-        </w:r>
-        <w:r>
-          <w:rPr>
-            <w:noProof/>
-            <w:webHidden/>
-          </w:rPr>
-        </w:r>
-        <w:r>
-          <w:rPr>
-            <w:noProof/>
-            <w:webHidden/>
-          </w:rPr>
           <w:fldChar w:fldCharType="separate"/>
-        </w:r>
-        <w:r>
-          <w:rPr>
-            <w:noProof/>
-            <w:webHidden/>
-          </w:rPr>
           <w:t>7</w:t>
-        </w:r>
-        <w:r>
-          <w:rPr>
-            <w:noProof/>
-            <w:webHidden/>
-          </w:rPr>
           <w:fldChar w:fldCharType="end"/>
         </w:r>
       </w:hyperlink>
@@ -2173,46 +1337,10 @@
             <w:webHidden/>
           </w:rPr>
           <w:tab/>
-        </w:r>
-        <w:r>
-          <w:rPr>
-            <w:noProof/>
-            <w:webHidden/>
-          </w:rPr>
           <w:fldChar w:fldCharType="begin"/>
-        </w:r>
-        <w:r>
-          <w:rPr>
-            <w:noProof/>
-            <w:webHidden/>
-          </w:rPr>
           <w:instrText xml:space="preserve"> PAGEREF _Toc97383752 \h </w:instrText>
-        </w:r>
-        <w:r>
-          <w:rPr>
-            <w:noProof/>
-            <w:webHidden/>
-          </w:rPr>
-        </w:r>
-        <w:r>
-          <w:rPr>
-            <w:noProof/>
-            <w:webHidden/>
-          </w:rPr>
           <w:fldChar w:fldCharType="separate"/>
-        </w:r>
-        <w:r>
-          <w:rPr>
-            <w:noProof/>
-            <w:webHidden/>
-          </w:rPr>
           <w:t>7</w:t>
-        </w:r>
-        <w:r>
-          <w:rPr>
-            <w:noProof/>
-            <w:webHidden/>
-          </w:rPr>
           <w:fldChar w:fldCharType="end"/>
         </w:r>
       </w:hyperlink>
@@ -2249,46 +1377,10 @@
             <w:webHidden/>
           </w:rPr>
           <w:tab/>
-        </w:r>
-        <w:r>
-          <w:rPr>
-            <w:noProof/>
-            <w:webHidden/>
-          </w:rPr>
           <w:fldChar w:fldCharType="begin"/>
-        </w:r>
-        <w:r>
-          <w:rPr>
-            <w:noProof/>
-            <w:webHidden/>
-          </w:rPr>
           <w:instrText xml:space="preserve"> PAGEREF _Toc97383753 \h </w:instrText>
-        </w:r>
-        <w:r>
-          <w:rPr>
-            <w:noProof/>
-            <w:webHidden/>
-          </w:rPr>
-        </w:r>
-        <w:r>
-          <w:rPr>
-            <w:noProof/>
-            <w:webHidden/>
-          </w:rPr>
           <w:fldChar w:fldCharType="separate"/>
-        </w:r>
-        <w:r>
-          <w:rPr>
-            <w:noProof/>
-            <w:webHidden/>
-          </w:rPr>
           <w:t>8</w:t>
-        </w:r>
-        <w:r>
-          <w:rPr>
-            <w:noProof/>
-            <w:webHidden/>
-          </w:rPr>
           <w:fldChar w:fldCharType="end"/>
         </w:r>
       </w:hyperlink>
@@ -2325,46 +1417,10 @@
             <w:webHidden/>
           </w:rPr>
           <w:tab/>
-        </w:r>
-        <w:r>
-          <w:rPr>
-            <w:noProof/>
-            <w:webHidden/>
-          </w:rPr>
           <w:fldChar w:fldCharType="begin"/>
-        </w:r>
-        <w:r>
-          <w:rPr>
-            <w:noProof/>
-            <w:webHidden/>
-          </w:rPr>
           <w:instrText xml:space="preserve"> PAGEREF _Toc97383754 \h </w:instrText>
-        </w:r>
-        <w:r>
-          <w:rPr>
-            <w:noProof/>
-            <w:webHidden/>
-          </w:rPr>
-        </w:r>
-        <w:r>
-          <w:rPr>
-            <w:noProof/>
-            <w:webHidden/>
-          </w:rPr>
           <w:fldChar w:fldCharType="separate"/>
-        </w:r>
-        <w:r>
-          <w:rPr>
-            <w:noProof/>
-            <w:webHidden/>
-          </w:rPr>
           <w:t>8</w:t>
-        </w:r>
-        <w:r>
-          <w:rPr>
-            <w:noProof/>
-            <w:webHidden/>
-          </w:rPr>
           <w:fldChar w:fldCharType="end"/>
         </w:r>
       </w:hyperlink>
@@ -2606,15 +1662,7 @@
                 <w:sz w:val="17"/>
                 <w:lang w:eastAsia="es-VE"/>
               </w:rPr>
-              <w:t xml:space="preserve">Fecha de </w:t>
-            </w:r>
-            <w:r>
-              <w:rPr>
-                <w:rFonts w:ascii="Arial" w:eastAsia="Times New Roman" w:hAnsi="Arial" w:cs="Arial"/>
-                <w:sz w:val="17"/>
-                <w:lang w:eastAsia="es-VE"/>
-              </w:rPr>
-              <w:t>inicio/fin</w:t>
+              <w:t xml:space="preserve">Fecha de inicio/fin</w:t>
             </w:r>
           </w:p>
         </w:tc>
@@ -4222,7 +3270,7 @@
           </w:tcPr>
           <w:p>
             <w:r>
-              <w:t>Feature freeze, versión candidata y borrador del informe final</w:t>
+              <w:t>Versión candidata y borrador del informe final</w:t>
             </w:r>
           </w:p>
         </w:tc>
@@ -4688,13 +3736,7 @@
               <w:rPr>
                 <w:sz w:val="18"/>
               </w:rPr>
-              <w:t>Plataforma web educativa B2B para Programación I con JavaScript. Un administrador podrá gobernar organizaciones y accesos; un profesor podrá administrar una clase, publicar actividades y consultar evidencia explicable; el estudiante podrá escribir y ejecutar código corto, recibir resultados de test cases, solicitar pistas y reintentar. El núcleo combinará ejecución controlada y evaluación determinística, registro de intentos, taxonomía acotada de errores, progreso simple por concepto, RAG mínimo con fuentes</w:t>
-            </w:r>
-            <w:r>
-              <w:rPr>
-                <w:sz w:val="18"/>
-              </w:rPr>
-              <w:t xml:space="preserve"> visibles y tres señales docentes: inactividad, error repetido y estancamiento. El LLM apoyará el diagnóstico y la redacción, pero no será la fuente única de verdad. El alcance administrativo se especifica en ALZ-RF-020 a ALZ-RF-027.</w:t>
+              <w:t xml:space="preserve">Plataforma web educativa B2B para Programación I con JavaScript. Un administrador podrá gobernar organizaciones y accesos; un profesor podrá administrar una clase, publicar actividades y consultar evidencia explicable; el estudiante podrá escribir y ejecutar código corto, recibir resultados de test cases, solicitar pistas y reintentar. El núcleo combinará ejecución controlada y evaluación determinística, registro de intentos, taxonomía acotada de errores, progreso simple por concepto, RAG mínimo con fuentes visibles y tres señales docentes: inactividad, error repetido y estancamiento. El LLM apoyará el diagnóstico y la redacción, pero no será la fuente única de verdad. El alcance administrativo se especifica en ALZ-RF-020 a ALZ-RF-027.</w:t>
             </w:r>
           </w:p>
         </w:tc>
@@ -5346,7 +4388,7 @@
           </w:tcPr>
           <w:p>
             <w:r>
-              <w:t>Congelar funciones y preparar la versión candidata.</w:t>
+              <w:t>Preparar la versión candidata para estabilización.</w:t>
             </w:r>
           </w:p>
         </w:tc>
@@ -5366,7 +4408,7 @@
               <w:rPr>
                 <w:sz w:val="17"/>
               </w:rPr>
-              <w:t>Feature freeze, versión candidata y borrador del informe final en semana 15; informe final, demo y defensa en semanas 17-18.</w:t>
+              <w:t>Versión candidata y borrador del informe final en semana 15; informe final, demo y defensa en semanas 17-18.</w:t>
             </w:r>
           </w:p>
         </w:tc>
@@ -5705,13 +4747,7 @@
               <w:rPr>
                 <w:sz w:val="18"/>
               </w:rPr>
-              <w:t>Implementar autenticación, organizaciones, usuarios, roles, cursos y clases, actividades, ejercicios e intentos con autorización en backend. Ejecutar código JavaScript corto en un entorno controlado con límites y test cases. Persistir telemetría mínima y clasificar errores mediante reglas y salidas estructuradas validadas. Implementar feedback progresivo y un RAG mínimo filtrado por clase, con referencias visibles. Mostrar progreso y tres señales docentes explicables basadas en evidencia. Incorporar pruebas</w:t>
-            </w:r>
-            <w:r>
-              <w:rPr>
-                <w:sz w:val="18"/>
-              </w:rPr>
-              <w:t>, observabilidad, seguridad, Docker, documentación y evidencia de contribución del equipo. Incorporar gobierno de taxonomías, banco de ejercicios, materiales RAG, reglas de señales y auditoría/exportación operativa.</w:t>
+              <w:t>Implementar autenticación, organizaciones, usuarios, roles, cursos y clases, actividades, ejercicios e intentos con autorización en backend. Ejecutar código JavaScript corto en un entorno controlado con límites y test cases. Persistir telemetría mínima y clasificar errores mediante reglas y salidas estructuradas validadas. Implementar feedback progresivo y un RAG mínimo filtrado por clase, con referencias visibles. Mostrar progreso y tres señales docentes explicables basadas en evidencia. Incorporar pruebas, observabilidad, seguridad, Docker, documentación y evidencia de contribución del equipo. Incorporar gobierno de taxonomías, banco de ejercicios, materiales RAG, reglas de señales y auditoría/exportación operativa.</w:t>
             </w:r>
           </w:p>
         </w:tc>
@@ -5763,13 +4799,7 @@
               <w:rPr>
                 <w:sz w:val="18"/>
               </w:rPr>
-              <w:t>MVP web funcional con perfiles de administrador, profesor y estudiante y datos de demostración. Repositorio GitHub público y activo, Product Backlog, Sprint Backlogs y evidencia de revisión/retrospectiva. Requisitos, prototipos, arquitectura, modelo de datos, UML y decisiones técnicas. Ejecutor JavaScript controlado, módulo de IA, RAG mínimo, panel docente y señales. Plan y resultados de pruebas unitarias, integración, rendimiento, seguridad e IA/RAG. Dockerfile, Docker Compose, variables documentadas, READ</w:t>
-            </w:r>
-            <w:r>
-              <w:rPr>
-                <w:sz w:val="18"/>
-              </w:rPr>
-              <w:t>ME, manual técnico y de despliegue. Informes CAPSTONE de avance y final, presentación, demo y evidencias de cumplimiento.</w:t>
+              <w:t>MVP web funcional con perfiles de administrador, profesor y estudiante y datos de demostración. Repositorio GitHub público y activo, Product Backlog, Sprint Backlogs y evidencia de revisión/retrospectiva. Requisitos, prototipos, arquitectura, modelo de datos, UML y decisiones técnicas. Ejecutor JavaScript controlado, módulo de IA, RAG mínimo, panel docente y señales. Plan y resultados de pruebas unitarias, integración, rendimiento, seguridad e IA/RAG. Dockerfile, Docker Compose, variables documentadas, README, manual técnico y de despliegue. Informes CAPSTONE de avance y final, presentación, demo y evidencias de cumplimiento.</w:t>
             </w:r>
           </w:p>
         </w:tc>
@@ -5853,16 +4883,6 @@
               </w:rPr>
               <w:t>Administración acotada de organizaciones, usuarios, roles, cursos, clases, taxonomía, banco de ejercicios, materiales RAG, reglas versionadas y auditoría/exportación operativa. Inicio de sesión con Supabase Auth; NestJS valida el JWT y aplica rol, organización y pertenencia a clase. RLS protege tablas y Storage expuestos por organización y clase, usando datos del servidor o app_metadata, nunca user_metadata; service_role queda solo en servidor. Administración de una clase, conceptos, ejercicios, test cases y actividades. Editor de código, ejecutar, enviar, reintentar, solicitar pistas y revisar progreso. Evaluación determinística, persistencia de intentos y resultados técnicos normalizados. Diagnóstico UNKNOWN cuando falte evidencia. RAG con fuentes PDF textual, TXT o Markdown de hasta 10 MB, filtro por clase, recuperación top-k=5 fragmentos y fuente visible. La línea base RAG usa fragmentos de 500 tokens y solapamiento de 50. El progreso y las tres señales conservan las reglas vigentes. Vercel Sandbox aporta 1 vCPU y 2 GB por ejecución productiva; el proceso estudiantil queda limitado a 128 MB, 3 segundos y 64 KB, sin secretos, archivos del anfitrión ni red no autorizada. Docker Compose, Supabase CLI y un adaptador Docker cubren el desarrollo local.</w:t>
             </w:r>
-            <w:r>
-              <w:rPr>
-                <w:sz w:val="18"/>
-              </w:rPr>
-            </w:r>
-            <w:r>
-              <w:rPr>
-                <w:sz w:val="18"/>
-              </w:rPr>
-            </w:r>
           </w:p>
         </w:tc>
       </w:tr>
@@ -5915,16 +4935,6 @@
               </w:rPr>
               <w:t>Duración fija de 18 semanas y equipo de tres integrantes. MVP limitado a Programación I, JavaScript, código corto y administración multi-organización acotada; la demo canónica utilizará 2 organizaciones, 2 administradores, 2 profesores, 8 estudiantes, 3 clases, 10 ejercicios y 2 documentos por clase, con datos ficticios reproducibles. Incluye administrador, profesor y estudiante, junto con gobierno de usuarios, cursos, taxonomía, ejercicios, fuentes, reglas y auditoría operativa. No incluye LMS completo, app móvil nativa, SSO, pagos, detector de plagio/IA ni calificación automática de alto impacto. El tablero muestra agregados deterministas; la IA/RAG solo recupera material oficial y redacta apoyo pedagógico. AD-ARQ-001 fija Next.js/React 19/TypeScript 5.x en Vercel; NestJS 12/Node.js 24 LTS en Azure Container Apps; Supabase PostgreSQL, Auth, Storage, RLS y pgvector; Vercel Sandbox; Azure OpenAI configurable; Docker Compose, Supabase CLI, Jest, Cypress y GitHub Actions.</w:t>
             </w:r>
-            <w:r>
-              <w:rPr>
-                <w:sz w:val="18"/>
-              </w:rPr>
-            </w:r>
-            <w:r>
-              <w:rPr>
-                <w:sz w:val="18"/>
-              </w:rPr>
-            </w:r>
           </w:p>
         </w:tc>
       </w:tr>
@@ -5983,7 +4993,7 @@
                 <w:rFonts w:ascii="Arial" w:hAnsi="Arial"/>
                 <w:sz w:val="17"/>
               </w:rPr>
-              <w:t>Alcance excesivo: priorización MoSCoW, vertical obligatoria y feature freeze en semana 15.</w:t>
+              <w:t>Alcance excesivo: priorización MoSCoW y vertical obligatoria.</w:t>
             </w:r>
           </w:p>
           <w:p>
@@ -6129,11 +5139,6 @@
               </w:rPr>
               <w:t>Stack de la línea base técnica 1.3: Next.js con App Router, React 19, TypeScript 5.x, Tailwind CSS, shadcn/ui, Recharts y Zod; frontend en Vercel con previews por pull request; NestJS 12 sobre Node.js 24 LTS en Azure Container Apps; Supabase para PostgreSQL administrado con objetivo de compatibilidad PostgreSQL 17, Auth, Storage, RLS y pgvector; Vercel Sandbox como ejecutor productivo; Azure OpenAI como proveedor inicial mediante una interfaz configurable; Docker Compose, Supabase CLI y adaptador Docker en local; Jest, Cypress y GitHub Actions. NestJS conserva dominio, autorización, auditoría y orquestación; Next.js no duplica la API. Cada intento registra identificador correlacionable, duración, región del sandbox, consumo, truncamiento, errores y estado de proveedores.</w:t>
             </w:r>
-            <w:r>
-              <w:rPr>
-                <w:sz w:val="18"/>
-              </w:rPr>
-            </w:r>
           </w:p>
         </w:tc>
       </w:tr>
@@ -6152,19 +5157,7 @@
           <w:color w:val="auto"/>
         </w:rPr>
         <w:lastRenderedPageBreak/>
-        <w:t xml:space="preserve">Tipo de </w:t>
-      </w:r>
-      <w:r>
-        <w:rPr>
-          <w:color w:val="auto"/>
-        </w:rPr>
-        <w:t xml:space="preserve">Interfaz de </w:t>
-      </w:r>
-      <w:r>
-        <w:rPr>
-          <w:color w:val="auto"/>
-        </w:rPr>
-        <w:t>Hardware</w:t>
+        <w:t xml:space="preserve">Tipo de Interfaz de Hardware</w:t>
       </w:r>
       <w:bookmarkEnd w:id="27"/>
     </w:p>
@@ -6268,19 +5261,7 @@
         <w:rPr>
           <w:color w:val="auto"/>
         </w:rPr>
-        <w:t xml:space="preserve">Tipo de </w:t>
-      </w:r>
-      <w:r>
-        <w:rPr>
-          <w:color w:val="auto"/>
-        </w:rPr>
-        <w:t xml:space="preserve">Interfaz </w:t>
-      </w:r>
-      <w:r>
-        <w:rPr>
-          <w:color w:val="auto"/>
-        </w:rPr>
-        <w:t>de Software</w:t>
+        <w:t xml:space="preserve">Tipo de Interfaz de Software</w:t>
       </w:r>
       <w:bookmarkEnd w:id="28"/>
     </w:p>
@@ -6315,11 +5296,6 @@
               </w:rPr>
               <w:t>Navegadores modernos acceden al frontend Next.js en Vercel por HTTPS. La API NestJS en Azure Container Apps valida el JWT de Supabase Auth y concentra dominio, autorización, auditoría y orquestación. Supabase entrega PostgreSQL, Storage, RLS y pgvector; Azure OpenAI se consume mediante una interfaz configurable. Vercel Sandbox ejecuta código no confiable en un entorno desechable y el desarrollo local usa Docker Compose, Supabase CLI y un adaptador Docker. GitHub Actions ejecuta controles y cada pull request obtiene un preview Vercel. La extracción, fragmentación, embeddings e indexación se limitan al corpus autorizado.</w:t>
             </w:r>
-            <w:r>
-              <w:rPr>
-                <w:sz w:val="18"/>
-              </w:rPr>
-            </w:r>
           </w:p>
         </w:tc>
       </w:tr>
@@ -6337,19 +5313,7 @@
         <w:rPr>
           <w:color w:val="auto"/>
         </w:rPr>
-        <w:t xml:space="preserve">Tipo de </w:t>
-      </w:r>
-      <w:r>
-        <w:rPr>
-          <w:color w:val="auto"/>
-        </w:rPr>
-        <w:t xml:space="preserve">Interfaz </w:t>
-      </w:r>
-      <w:r>
-        <w:rPr>
-          <w:color w:val="auto"/>
-        </w:rPr>
-        <w:t>de Usuario</w:t>
+        <w:t xml:space="preserve">Tipo de Interfaz de Usuario</w:t>
       </w:r>
       <w:bookmarkEnd w:id="29"/>
     </w:p>

</xml_diff>